<commit_message>
Integrate the measure-beats-predict finding: probe-encode result into paper (new Table + abstract + contributions)
The cross-class predictability experiment now anchors Section 6.1: source-image
statistics do not predict the atlas saving (and fail even on the isolated codec
differential), while a 10-20 tile probe encode forecasts it to ~2 points
(Spearman 0.98). New Table (predictor comparison), and the finding is lifted into
the abstract and contributions. Also surfaces the memory result in the abstract
(atlas fastest-to-visible and lowest-memory), per the review. Paper now 10 tables,
5 figures; downloads regenerated.

Co-Authored-By: Claude Fable 5 <noreply@anthropic.com>
</commit_message>
<xml_diff>
--- a/docs/paper.docx
+++ b/docs/paper.docx
@@ -217,13 +217,37 @@
         <w:t xml:space="preserve"> </w:t>
       </w:r>
       <w:r>
-        <w:t xml:space="preserve">five unseen collections. A supporting browser study shows the byte savings also cut load</w:t>
-      </w:r>
-      <w:r>
-        <w:t xml:space="preserve"> </w:t>
-      </w:r>
-      <w:r>
-        <w:t xml:space="preserve">time on HTTP/1.1 and HTTP/3.</w:t>
+        <w:t xml:space="preserve">five unseen collections. The byte effect resists prediction from source-image statistics,</w:t>
+      </w:r>
+      <w:r>
+        <w:t xml:space="preserve"> </w:t>
+      </w:r>
+      <w:r>
+        <w:t xml:space="preserve">which is why the tool measures rather than models: a probe encode of ten to twenty tiles</w:t>
+      </w:r>
+      <w:r>
+        <w:t xml:space="preserve"> </w:t>
+      </w:r>
+      <w:r>
+        <w:t xml:space="preserve">forecasts a group's saving to within two percentage points where colour, edge, and</w:t>
+      </w:r>
+      <w:r>
+        <w:t xml:space="preserve"> </w:t>
+      </w:r>
+      <w:r>
+        <w:t xml:space="preserve">frequency features cannot. In a live renderer the pixel atlas is also the fastest to full</w:t>
+      </w:r>
+      <w:r>
+        <w:t xml:space="preserve"> </w:t>
+      </w:r>
+      <w:r>
+        <w:t xml:space="preserve">visibility and the lowest in memory, and a supporting browser study shows the byte savings</w:t>
+      </w:r>
+      <w:r>
+        <w:t xml:space="preserve"> </w:t>
+      </w:r>
+      <w:r>
+        <w:t xml:space="preserve">cut load time on HTTP/1.1 and HTTP/3.</w:t>
       </w:r>
     </w:p>
     <w:bookmarkStart w:id="20" w:name="introduction"/>
@@ -594,13 +618,31 @@
         <w:t xml:space="preserve"> </w:t>
       </w:r>
       <w:r>
-        <w:t xml:space="preserve">sharing fixed costs and losses from sharing adaptive state; and (v) an open-source</w:t>
-      </w:r>
-      <w:r>
-        <w:t xml:space="preserve"> </w:t>
-      </w:r>
-      <w:r>
-        <w:t xml:space="preserve">construction heuristic that emits deployable bundles from a directory of images.</w:t>
+        <w:t xml:space="preserve">sharing fixed costs and losses from sharing adaptive state, together with the finding that</w:t>
+      </w:r>
+      <w:r>
+        <w:t xml:space="preserve"> </w:t>
+      </w:r>
+      <w:r>
+        <w:t xml:space="preserve">this adaptive-state penalty is codec-mechanistic and not predictable from source-image</w:t>
+      </w:r>
+      <w:r>
+        <w:t xml:space="preserve"> </w:t>
+      </w:r>
+      <w:r>
+        <w:t xml:space="preserve">statistics, while a small probe encode forecasts it accurately; and (v) an open-source</w:t>
+      </w:r>
+      <w:r>
+        <w:t xml:space="preserve"> </w:t>
+      </w:r>
+      <w:r>
+        <w:t xml:space="preserve">construction heuristic, built on that probe-not-predict principle, that emits deployable</w:t>
+      </w:r>
+      <w:r>
+        <w:t xml:space="preserve"> </w:t>
+      </w:r>
+      <w:r>
+        <w:t xml:space="preserve">bundles from a directory of images.</w:t>
       </w:r>
     </w:p>
     <w:bookmarkEnd w:id="20"/>
@@ -1416,7 +1458,7 @@
         <w:t xml:space="preserve"> </w:t>
       </w:r>
       <w:r>
-        <w:t xml:space="preserve">control, and browser support, compared for deployment in Table 9</w:t>
+        <w:t xml:space="preserve">control, and browser support, compared for deployment in Table 10</w:t>
       </w:r>
       <w:r>
         <w:t xml:space="preserve"> </w:t>
@@ -3523,7 +3565,7 @@
               <a:graphicData uri="http://schemas.openxmlformats.org/drawingml/2006/picture">
                 <pic:pic>
                   <pic:nvPicPr>
-                    <pic:cNvPr descr="file:///E:/tmp/tmp9qsra96d/svg0.png" id="41" name="Picture"/>
+                    <pic:cNvPr descr="file:///E:/tmp/tmpp6w6b83g/svg0.png" id="41" name="Picture"/>
                     <pic:cNvPicPr>
                       <a:picLocks noChangeArrowheads="1" noChangeAspect="1"/>
                     </pic:cNvPicPr>
@@ -9072,7 +9114,7 @@
                     <a:graphicData uri="http://schemas.openxmlformats.org/drawingml/2006/picture">
                       <pic:pic>
                         <pic:nvPicPr>
-                          <pic:cNvPr descr="file:///E:/tmp/tmp9qsra96d/svg1.png" id="48" name="Picture"/>
+                          <pic:cNvPr descr="file:///E:/tmp/tmpp6w6b83g/svg1.png" id="48" name="Picture"/>
                           <pic:cNvPicPr>
                             <a:picLocks noChangeArrowheads="1" noChangeAspect="1"/>
                           </pic:cNvPicPr>
@@ -9114,7 +9156,7 @@
                     <a:graphicData uri="http://schemas.openxmlformats.org/drawingml/2006/picture">
                       <pic:pic>
                         <pic:nvPicPr>
-                          <pic:cNvPr descr="file:///E:/tmp/tmp9qsra96d/svg2.png" id="51" name="Picture"/>
+                          <pic:cNvPr descr="file:///E:/tmp/tmpp6w6b83g/svg2.png" id="51" name="Picture"/>
                           <pic:cNvPicPr>
                             <a:picLocks noChangeArrowheads="1" noChangeAspect="1"/>
                           </pic:cNvPicPr>
@@ -10258,39 +10300,325 @@
         <w:t xml:space="preserve"> </w:t>
       </w:r>
       <w:r>
-        <w:t xml:space="preserve">heterogeneity proxy captures the direction but not the full magnitude of the penalty; a</w:t>
-      </w:r>
-      <w:r>
-        <w:t xml:space="preserve"> </w:t>
-      </w:r>
-      <w:r>
-        <w:t xml:space="preserve">predictive model accurate across codecs will need codec-specific structure (the</w:t>
-      </w:r>
-      <w:r>
-        <w:t xml:space="preserve"> </w:t>
-      </w:r>
-      <w:r>
-        <w:t xml:space="preserve">four-segment allocation for VP8, the per-scanline filter for PNG), which we leave to</w:t>
-      </w:r>
-      <w:r>
-        <w:t xml:space="preserve"> </w:t>
-      </w:r>
-      <w:r>
-        <w:t xml:space="preserve">future work. The practical takeaway stands without the full model: measure the two</w:t>
-      </w:r>
-      <w:r>
-        <w:t xml:space="preserve"> </w:t>
-      </w:r>
-      <w:r>
-        <w:t xml:space="preserve">candidate representations for a group and keep the smaller, which is what the heuristic</w:t>
-      </w:r>
-      <w:r>
-        <w:t xml:space="preserve"> </w:t>
-      </w:r>
-      <w:r>
-        <w:t xml:space="preserve">of Section 6.3 does and why it reaches the oracle out-of-sample.</w:t>
-      </w:r>
-    </w:p>
+        <w:t xml:space="preserve">heterogeneity proxy captures the direction but not the full magnitude of the penalty.</w:t>
+      </w:r>
+    </w:p>
+    <w:p>
+      <w:pPr>
+        <w:pStyle w:val="BodyText"/>
+      </w:pPr>
+      <w:r>
+        <w:t xml:space="preserve">How far can the saving be predicted from the source images alone, before building any</w:t>
+      </w:r>
+      <w:r>
+        <w:t xml:space="preserve"> </w:t>
+      </w:r>
+      <w:r>
+        <w:t xml:space="preserve">atlas? We tested this directly. Eight content classes were assembled to span extreme</w:t>
+      </w:r>
+      <w:r>
+        <w:t xml:space="preserve"> </w:t>
+      </w:r>
+      <w:r>
+        <w:t xml:space="preserve">image statistics, natural photos, emoji, flags, and avatars alongside synthetic</w:t>
+      </w:r>
+      <w:r>
+        <w:t xml:space="preserve"> </w:t>
+      </w:r>
+      <w:r>
+        <w:t xml:space="preserve">gradients, noise, UI mockups, and objects on white, and six cheap features were computed</w:t>
+      </w:r>
+      <w:r>
+        <w:t xml:space="preserve"> </w:t>
+      </w:r>
+      <w:r>
+        <w:t xml:space="preserve">per class (edge density, DCT high-frequency energy, colour-histogram entropy, unique</w:t>
+      </w:r>
+      <w:r>
+        <w:t xml:space="preserve"> </w:t>
+      </w:r>
+      <w:r>
+        <w:t xml:space="preserve">colours, inter-tile heterogeneity, and luminance variance). Predicting a held-out class's</w:t>
+      </w:r>
+      <w:r>
+        <w:t xml:space="preserve"> </w:t>
+      </w:r>
+      <w:r>
+        <w:t xml:space="preserve">saving from these features does not improve on a size-and-codec baseline, and it fails</w:t>
+      </w:r>
+      <w:r>
+        <w:t xml:space="preserve"> </w:t>
+      </w:r>
+      <w:r>
+        <w:t xml:space="preserve">even on the isolated codec differential that cancels the fixed-cost term (Table 8):</w:t>
+      </w:r>
+      <w:r>
+        <w:t xml:space="preserve"> </w:t>
+      </w:r>
+      <w:r>
+        <w:t xml:space="preserve">the adaptive-state penalty is codec-mechanistic and is not readable from source pixel</w:t>
+      </w:r>
+      <w:r>
+        <w:t xml:space="preserve"> </w:t>
+      </w:r>
+      <w:r>
+        <w:t xml:space="preserve">statistics. What does predict it is a measurement: a probe encode of only 10–20</w:t>
+      </w:r>
+      <w:r>
+        <w:t xml:space="preserve"> </w:t>
+      </w:r>
+      <w:r>
+        <w:t xml:space="preserve">tiles estimates the full-set saving to within about two percentage points (Spearman 0.98).</w:t>
+      </w:r>
+      <w:r>
+        <w:t xml:space="preserve"> </w:t>
+      </w:r>
+      <w:r>
+        <w:t xml:space="preserve">This is the empirical case for the design of Section 6.3: the right move is not to</w:t>
+      </w:r>
+      <w:r>
+        <w:t xml:space="preserve"> </w:t>
+      </w:r>
+      <w:r>
+        <w:t xml:space="preserve">model the penalty but to measure the two candidate representations, and a small probe</w:t>
+      </w:r>
+      <w:r>
+        <w:t xml:space="preserve"> </w:t>
+      </w:r>
+      <w:r>
+        <w:t xml:space="preserve">suffices, which is why the heuristic reaches the oracle out-of-sample without any content</w:t>
+      </w:r>
+      <w:r>
+        <w:t xml:space="preserve"> </w:t>
+      </w:r>
+      <w:r>
+        <w:t xml:space="preserve">model.</w:t>
+      </w:r>
+    </w:p>
+    <w:p>
+      <w:pPr>
+        <w:pStyle w:val="TableCaption"/>
+      </w:pPr>
+      <w:r>
+        <w:rPr>
+          <w:b/>
+          <w:bCs/>
+        </w:rPr>
+        <w:t xml:space="preserve">Table 8.</w:t>
+      </w:r>
+      <w:r>
+        <w:t xml:space="preserve"> </w:t>
+      </w:r>
+      <w:r>
+        <w:t xml:space="preserve">Predicting a group's atlas saving before building it, evaluated leave-one-content-class-out over eight classes spanning extreme image statistics (natural photos, emoji, flags, avatars, and synthetic gradients, noise, UI mockups, and objects on white; JPEG and WebP). Error is mean absolute error in percentage points against the measured saving; rank is Spearman correlation with it. Six cheap source-image features do not improve on a size-and-codec baseline, but a probe encode of 10–20 tiles predicts the full-set saving to within about two points. On the isolated codec differential (JPEG minus WebP saving, which cancels the fixed-cost term), the same features still fail to beat a constant (10.1 vs 7.1 percentage points), so the shortfall is not a missing fixed-cost signal but the coupling penalty being unreadable from source pixels.</w:t>
+      </w:r>
+    </w:p>
+    <w:tbl>
+      <w:tblPr>
+        <w:tblStyle w:val="Table"/>
+        <w:tblW w:type="auto" w:w="0"/>
+        <w:tblLook w:firstRow="1" w:lastRow="0" w:firstColumn="0" w:lastColumn="0" w:noHBand="0" w:noVBand="0" w:val="0020"/>
+        <w:tblCaption w:val="Table 8. Predicting a group's atlas saving before building it, evaluated leave-one-content-class-out over eight classes spanning extreme image statistics (natural photos, emoji, flags, avatars, and synthetic gradients, noise, UI mockups, and objects on white; JPEG and WebP). Error is mean absolute error in percentage points against the measured saving; rank is Spearman correlation with it. Six cheap source-image features do not improve on a size-and-codec baseline, but a probe encode of 10–20 tiles predicts the full-set saving to within about two points. On the isolated codec differential (JPEG minus WebP saving, which cancels the fixed-cost term), the same features still fail to beat a constant (10.1 vs 7.1 percentage points), so the shortfall is not a missing fixed-cost signal but the coupling penalty being unreadable from source pixels."/>
+      </w:tblPr>
+      <w:tblGrid>
+        <w:gridCol w:w="2640"/>
+        <w:gridCol w:w="2640"/>
+        <w:gridCol w:w="2640"/>
+      </w:tblGrid>
+      <w:tr>
+        <w:trPr>
+          <w:tblHeader w:val="on"/>
+        </w:trPr>
+        <w:tc>
+          <w:tcPr/>
+          <w:p>
+            <w:pPr>
+              <w:pStyle w:val="Compact"/>
+              <w:jc w:val="left"/>
+            </w:pPr>
+            <w:r>
+              <w:t xml:space="preserve">predictor</w:t>
+            </w:r>
+          </w:p>
+        </w:tc>
+        <w:tc>
+          <w:tcPr/>
+          <w:p>
+            <w:pPr>
+              <w:pStyle w:val="Compact"/>
+              <w:jc w:val="left"/>
+            </w:pPr>
+            <w:r>
+              <w:t xml:space="preserve">MAE (pp)</w:t>
+            </w:r>
+          </w:p>
+        </w:tc>
+        <w:tc>
+          <w:tcPr/>
+          <w:p>
+            <w:pPr>
+              <w:pStyle w:val="Compact"/>
+              <w:jc w:val="left"/>
+            </w:pPr>
+            <w:r>
+              <w:t xml:space="preserve">rank</w:t>
+            </w:r>
+          </w:p>
+        </w:tc>
+      </w:tr>
+      <w:tr>
+        <w:tc>
+          <w:tcPr/>
+          <w:p>
+            <w:pPr>
+              <w:pStyle w:val="Compact"/>
+              <w:jc w:val="left"/>
+            </w:pPr>
+            <w:r>
+              <w:t xml:space="preserve">size + codec + one encode (baseline)</w:t>
+            </w:r>
+          </w:p>
+        </w:tc>
+        <w:tc>
+          <w:tcPr/>
+          <w:p>
+            <w:pPr>
+              <w:pStyle w:val="Compact"/>
+              <w:jc w:val="left"/>
+            </w:pPr>
+            <w:r>
+              <w:t xml:space="preserve">4.95</w:t>
+            </w:r>
+          </w:p>
+        </w:tc>
+        <w:tc>
+          <w:tcPr/>
+          <w:p>
+            <w:pPr>
+              <w:pStyle w:val="Compact"/>
+              <w:jc w:val="left"/>
+            </w:pPr>
+            <w:r>
+              <w:t xml:space="preserve">n/a</w:t>
+            </w:r>
+          </w:p>
+        </w:tc>
+      </w:tr>
+      <w:tr>
+        <w:tc>
+          <w:tcPr/>
+          <w:p>
+            <w:pPr>
+              <w:pStyle w:val="Compact"/>
+              <w:jc w:val="left"/>
+            </w:pPr>
+            <w:r>
+              <w:t xml:space="preserve">+ six source-image features</w:t>
+            </w:r>
+          </w:p>
+        </w:tc>
+        <w:tc>
+          <w:tcPr/>
+          <w:p>
+            <w:pPr>
+              <w:pStyle w:val="Compact"/>
+              <w:jc w:val="left"/>
+            </w:pPr>
+            <w:r>
+              <w:t xml:space="preserve">6.05</w:t>
+            </w:r>
+          </w:p>
+        </w:tc>
+        <w:tc>
+          <w:tcPr/>
+          <w:p>
+            <w:pPr>
+              <w:pStyle w:val="Compact"/>
+              <w:jc w:val="left"/>
+            </w:pPr>
+            <w:r>
+              <w:t xml:space="preserve">n/a</w:t>
+            </w:r>
+          </w:p>
+        </w:tc>
+      </w:tr>
+      <w:tr>
+        <w:tc>
+          <w:tcPr/>
+          <w:p>
+            <w:pPr>
+              <w:pStyle w:val="Compact"/>
+              <w:jc w:val="left"/>
+            </w:pPr>
+            <w:r>
+              <w:t xml:space="preserve">10-tile probe encode</w:t>
+            </w:r>
+          </w:p>
+        </w:tc>
+        <w:tc>
+          <w:tcPr/>
+          <w:p>
+            <w:pPr>
+              <w:pStyle w:val="Compact"/>
+              <w:jc w:val="left"/>
+            </w:pPr>
+            <w:r>
+              <w:t xml:space="preserve">2.31</w:t>
+            </w:r>
+          </w:p>
+        </w:tc>
+        <w:tc>
+          <w:tcPr/>
+          <w:p>
+            <w:pPr>
+              <w:pStyle w:val="Compact"/>
+              <w:jc w:val="left"/>
+            </w:pPr>
+            <w:r>
+              <w:t xml:space="preserve">0.98</w:t>
+            </w:r>
+          </w:p>
+        </w:tc>
+      </w:tr>
+      <w:tr>
+        <w:tc>
+          <w:tcPr/>
+          <w:p>
+            <w:pPr>
+              <w:pStyle w:val="Compact"/>
+              <w:jc w:val="left"/>
+            </w:pPr>
+            <w:r>
+              <w:t xml:space="preserve">20-tile probe encode</w:t>
+            </w:r>
+          </w:p>
+        </w:tc>
+        <w:tc>
+          <w:tcPr/>
+          <w:p>
+            <w:pPr>
+              <w:pStyle w:val="Compact"/>
+              <w:jc w:val="left"/>
+            </w:pPr>
+            <w:r>
+              <w:t xml:space="preserve">1.62</w:t>
+            </w:r>
+          </w:p>
+        </w:tc>
+        <w:tc>
+          <w:tcPr/>
+          <w:p>
+            <w:pPr>
+              <w:pStyle w:val="Compact"/>
+              <w:jc w:val="left"/>
+            </w:pPr>
+            <w:r>
+              <w:t xml:space="preserve">0.98</w:t>
+            </w:r>
+          </w:p>
+        </w:tc>
+      </w:tr>
+    </w:tbl>
     <w:p>
       <w:pPr>
         <w:pStyle w:val="BodyText"/>
@@ -10799,7 +11127,7 @@
               <a:graphicData uri="http://schemas.openxmlformats.org/drawingml/2006/picture">
                 <pic:pic>
                   <pic:nvPicPr>
-                    <pic:cNvPr descr="file:///E:/tmp/tmp9qsra96d/svg3.png" id="58" name="Picture"/>
+                    <pic:cNvPr descr="file:///E:/tmp/tmpp6w6b83g/svg3.png" id="58" name="Picture"/>
                     <pic:cNvPicPr>
                       <a:picLocks noChangeArrowheads="1" noChangeAspect="1"/>
                     </pic:cNvPicPr>
@@ -11039,7 +11367,7 @@
               <a:graphicData uri="http://schemas.openxmlformats.org/drawingml/2006/picture">
                 <pic:pic>
                   <pic:nvPicPr>
-                    <pic:cNvPr descr="file:///E:/tmp/tmp9qsra96d/svg4.png" id="62" name="Picture"/>
+                    <pic:cNvPr descr="file:///E:/tmp/tmpp6w6b83g/svg4.png" id="62" name="Picture"/>
                     <pic:cNvPicPr>
                       <a:picLocks noChangeArrowheads="1" noChangeAspect="1"/>
                     </pic:cNvPicPr>
@@ -11099,7 +11427,7 @@
         <w:t xml:space="preserve">atlas_optimizer</w:t>
       </w:r>
       <w:r>
-        <w:t xml:space="preserve">. Exact duplicates collapse to shared coordinates; tiles are grouped by update cadence, lossless requirement, and dimensions; each group is routed by a short decision cascade to individual files, a pixel atlas, or a byte-bundle. The lossy branch is decided by measurement: a pixel atlas is chosen only if it is smaller than the byte-bundle and clears a per-tile SSIM floor, and lossless groups keep the smaller of a byte-bundle and a WebP-lossless strip. Groups are chunked for bounded cache invalidation and memory, and the tool emits the atlas and bundle files, a CSS coordinate map, a loader, and a savings report; piecewise updates can be served as dictionary deltas. This is the procedure evaluated against the oracle in Table 8.</w:t>
+        <w:t xml:space="preserve">. Exact duplicates collapse to shared coordinates; tiles are grouped by update cadence, lossless requirement, and dimensions; each group is routed by a short decision cascade to individual files, a pixel atlas, or a byte-bundle. The lossy branch is decided by measurement: a pixel atlas is chosen only if it is smaller than the byte-bundle and clears a per-tile SSIM floor, and lossless groups keep the smaller of a byte-bundle and a WebP-lossless strip. Groups are chunked for bounded cache invalidation and memory, and the tool emits the atlas and bundle files, a CSS coordinate map, a loader, and a savings report; piecewise updates can be served as dictionary deltas. This is the procedure evaluated against the oracle in Table 9.</w:t>
       </w:r>
     </w:p>
     <w:p>
@@ -11131,7 +11459,7 @@
         <w:t xml:space="preserve"> </w:t>
       </w:r>
       <w:r>
-        <w:t xml:space="preserve">returns the byte-optimal one (Table 8). Each group carries one measured tiebreak:</w:t>
+        <w:t xml:space="preserve">returns the byte-optimal one (Table 9). Each group carries one measured tiebreak:</w:t>
       </w:r>
       <w:r>
         <w:t xml:space="preserve"> </w:t>
@@ -11193,7 +11521,7 @@
         <w:pStyle w:val="BodyText"/>
       </w:pPr>
       <w:r>
-        <w:t xml:space="preserve">The value is in choosing, not in any single layout. Table 8 also scores three</w:t>
+        <w:t xml:space="preserve">The value is in choosing, not in any single layout. Table 9 also scores three</w:t>
       </w:r>
       <w:r>
         <w:t xml:space="preserve"> </w:t>
@@ -11253,7 +11581,7 @@
           <w:b/>
           <w:bCs/>
         </w:rPr>
-        <w:t xml:space="preserve">Table 8.</w:t>
+        <w:t xml:space="preserve">Table 9.</w:t>
       </w:r>
       <w:r>
         <w:t xml:space="preserve"> </w:t>
@@ -11267,7 +11595,7 @@
         <w:tblStyle w:val="Table"/>
         <w:tblW w:type="auto" w:w="0"/>
         <w:tblLook w:firstRow="1" w:lastRow="0" w:firstColumn="0" w:lastColumn="0" w:noHBand="0" w:noVBand="0" w:val="0020"/>
-        <w:tblCaption w:val="Table 8. Out-of-sample evaluation of the construction heuristic on five independent corpora that played no role in its calibration (Noto emoji, OpenMoji, country flags, Flickr photos, Robohash avatars; 100 tiles each). An offline oracle enumerates every candidate configuration (individual, grid atlas, strip atlas, byte-bundle across the admissible codecs) at matched quality and reports the byte-optimal one; regret is a policy's bytes over the oracle's. The last three columns are simple fixed-layout rules a developer might hardcode, each still allowed the best admissible codec (individual files cost the same bytes as a byte-bundle). The calibrated heuristic matches the oracle on all five corpora; every fixed rule is beaten on at least one, because the winning layout is content-dependent. Smaller regret is better."/>
+        <w:tblCaption w:val="Table 9. Out-of-sample evaluation of the construction heuristic on five independent corpora that played no role in its calibration (Noto emoji, OpenMoji, country flags, Flickr photos, Robohash avatars; 100 tiles each). An offline oracle enumerates every candidate configuration (individual, grid atlas, strip atlas, byte-bundle across the admissible codecs) at matched quality and reports the byte-optimal one; regret is a policy's bytes over the oracle's. The last three columns are simple fixed-layout rules a developer might hardcode, each still allowed the best admissible codec (individual files cost the same bytes as a byte-bundle). The calibrated heuristic matches the oracle on all five corpora; every fixed rule is beaten on at least one, because the winning layout is content-dependent. Smaller regret is better."/>
       </w:tblPr>
       <w:tblGrid>
         <w:gridCol w:w="990"/>
@@ -11988,7 +12316,7 @@
         <w:t xml:space="preserve"> </w:t>
       </w:r>
       <w:r>
-        <w:t xml:space="preserve">(Table 9). A CSS pixel atlas shown through</w:t>
+        <w:t xml:space="preserve">(Table 10). A CSS pixel atlas shown through</w:t>
       </w:r>
       <w:r>
         <w:t xml:space="preserve"> </w:t>
@@ -12153,7 +12481,7 @@
           <w:b/>
           <w:bCs/>
         </w:rPr>
-        <w:t xml:space="preserve">Table 9.</w:t>
+        <w:t xml:space="preserve">Table 10.</w:t>
       </w:r>
       <w:r>
         <w:t xml:space="preserve"> </w:t>
@@ -12185,7 +12513,7 @@
         <w:tblStyle w:val="Table"/>
         <w:tblW w:type="auto" w:w="0"/>
         <w:tblLook w:firstRow="1" w:lastRow="0" w:firstColumn="0" w:lastColumn="0" w:noHBand="0" w:noVBand="0" w:val="0020"/>
-        <w:tblCaption w:val="Table 9. Display mechanisms for a bundled tile and how they differ in production. All four paint after a single atlas or bundle fetch; they diverge on image semantics, accessibility, loading control, and support. Pick the byte layout with the Section 6.3 selector and the mechanism here."/>
+        <w:tblCaption w:val="Table 10. Display mechanisms for a bundled tile and how they differ in production. All four paint after a single atlas or bundle fetch; they diverge on image semantics, accessibility, loading control, and support. Pick the byte layout with the Section 6.3 selector and the mechanism here."/>
       </w:tblPr>
       <w:tblGrid>
         <w:gridCol w:w="1131"/>

</xml_diff>

<commit_message>
Probe-vs-N scaling validates the probe at N=500 (MAE ~2pp, perfect rank; 20 tiles = 4% of the group)
The review's prescribed experiment: fix k=20 and vary N in {50,100,200,500} on
three classes x two codecs. Result passes the pre-stated bar decisively: at N=500
the probe predicts the full-set saving to direct-MAE 1.94 and Spearman 1.000, and
MAE stays 1.0-1.94 with perfect class ordering at every N. The bias does not grow
with N. So a fixed 20-tile probe forecasts a 500-tile build (4% of the encode
work), which is the regime where the probe actually earns its place. Honest
caveat now in the paper: the one slip is the WebP near-break-even regime, where
the shared-quantizer penalty deepens with group size faster than a small probe
registers. Adds scripts/e_probe_scale.py + results; Section 6.1 strengthened.

Co-Authored-By: Claude Fable 5 <noreply@anthropic.com>
</commit_message>
<xml_diff>
--- a/docs/paper.docx
+++ b/docs/paper.docx
@@ -3565,7 +3565,7 @@
               <a:graphicData uri="http://schemas.openxmlformats.org/drawingml/2006/picture">
                 <pic:pic>
                   <pic:nvPicPr>
-                    <pic:cNvPr descr="file:///E:/tmp/tmpgzvd521s/svg0.png" id="41" name="Picture"/>
+                    <pic:cNvPr descr="file:///E:/tmp/tmpptqqmsvb/svg0.png" id="41" name="Picture"/>
                     <pic:cNvPicPr>
                       <a:picLocks noChangeArrowheads="1" noChangeAspect="1"/>
                     </pic:cNvPicPr>
@@ -9114,7 +9114,7 @@
                     <a:graphicData uri="http://schemas.openxmlformats.org/drawingml/2006/picture">
                       <pic:pic>
                         <pic:nvPicPr>
-                          <pic:cNvPr descr="file:///E:/tmp/tmpgzvd521s/svg1.png" id="48" name="Picture"/>
+                          <pic:cNvPr descr="file:///E:/tmp/tmpptqqmsvb/svg1.png" id="48" name="Picture"/>
                           <pic:cNvPicPr>
                             <a:picLocks noChangeArrowheads="1" noChangeAspect="1"/>
                           </pic:cNvPicPr>
@@ -9156,7 +9156,7 @@
                     <a:graphicData uri="http://schemas.openxmlformats.org/drawingml/2006/picture">
                       <pic:pic>
                         <pic:nvPicPr>
-                          <pic:cNvPr descr="file:///E:/tmp/tmpgzvd521s/svg2.png" id="51" name="Picture"/>
+                          <pic:cNvPr descr="file:///E:/tmp/tmpptqqmsvb/svg2.png" id="51" name="Picture"/>
                           <pic:cNvPicPr>
                             <a:picLocks noChangeArrowheads="1" noChangeAspect="1"/>
                           </pic:cNvPicPr>
@@ -10392,7 +10392,43 @@
         <w:t xml:space="preserve"> </w:t>
       </w:r>
       <w:r>
-        <w:t xml:space="preserve">(within-cell rank correlation 0.86 to 1.00).</w:t>
+        <w:t xml:space="preserve">(within-cell rank correlation 0.86 to 1.00). The probe holds as the group grows, which is</w:t>
+      </w:r>
+      <w:r>
+        <w:t xml:space="preserve"> </w:t>
+      </w:r>
+      <w:r>
+        <w:t xml:space="preserve">where it earns its keep: a fixed 20-tile probe predicts the saving to a mean absolute error</w:t>
+      </w:r>
+      <w:r>
+        <w:t xml:space="preserve"> </w:t>
+      </w:r>
+      <w:r>
+        <w:t xml:space="preserve">of about two points with perfect class ordering at every group size from 50 to 500 tiles,</w:t>
+      </w:r>
+      <w:r>
+        <w:t xml:space="preserve"> </w:t>
+      </w:r>
+      <w:r>
+        <w:t xml:space="preserve">so on a 500-tile bundle the decision costs one encode of four percent of the tiles. Its</w:t>
+      </w:r>
+      <w:r>
+        <w:t xml:space="preserve"> </w:t>
+      </w:r>
+      <w:r>
+        <w:t xml:space="preserve">only slip is the WebP near-break-even regime, where the shared-quantizer penalty deepens</w:t>
+      </w:r>
+      <w:r>
+        <w:t xml:space="preserve"> </w:t>
+      </w:r>
+      <w:r>
+        <w:t xml:space="preserve">with group size faster than a small probe registers, the one case a practitioner should</w:t>
+      </w:r>
+      <w:r>
+        <w:t xml:space="preserve"> </w:t>
+      </w:r>
+      <w:r>
+        <w:t xml:space="preserve">confirm on the full set.</w:t>
       </w:r>
       <w:r>
         <w:t xml:space="preserve"> </w:t>
@@ -11151,7 +11187,7 @@
               <a:graphicData uri="http://schemas.openxmlformats.org/drawingml/2006/picture">
                 <pic:pic>
                   <pic:nvPicPr>
-                    <pic:cNvPr descr="file:///E:/tmp/tmpgzvd521s/svg3.png" id="58" name="Picture"/>
+                    <pic:cNvPr descr="file:///E:/tmp/tmpptqqmsvb/svg3.png" id="58" name="Picture"/>
                     <pic:cNvPicPr>
                       <a:picLocks noChangeArrowheads="1" noChangeAspect="1"/>
                     </pic:cNvPicPr>
@@ -11391,7 +11427,7 @@
               <a:graphicData uri="http://schemas.openxmlformats.org/drawingml/2006/picture">
                 <pic:pic>
                   <pic:nvPicPr>
-                    <pic:cNvPr descr="file:///E:/tmp/tmpgzvd521s/svg4.png" id="62" name="Picture"/>
+                    <pic:cNvPr descr="file:///E:/tmp/tmpptqqmsvb/svg4.png" id="62" name="Picture"/>
                     <pic:cNvPicPr>
                       <a:picLocks noChangeArrowheads="1" noChangeAspect="1"/>
                     </pic:cNvPicPr>

</xml_diff>

<commit_message>
Tighten probe-scaling prose: drop "perfect ordering" (6 cells) to "orders tested cells", state 4% as tile fraction
Preemptive precision fixes on the probe-scaling claim: Spearman 1.000 is on six
class-codec cells per N, so the paper says "orders the tested class-codec cells
correctly" rather than "perfect class ordering"; and the compute framing is stated
as "measures just four percent of the tiles" (a tile fraction) rather than
implying a fixed compute multiple.

Co-Authored-By: Claude Fable 5 <noreply@anthropic.com>
</commit_message>
<xml_diff>
--- a/docs/paper.docx
+++ b/docs/paper.docx
@@ -3565,7 +3565,7 @@
               <a:graphicData uri="http://schemas.openxmlformats.org/drawingml/2006/picture">
                 <pic:pic>
                   <pic:nvPicPr>
-                    <pic:cNvPr descr="file:///E:/tmp/tmpptqqmsvb/svg0.png" id="41" name="Picture"/>
+                    <pic:cNvPr descr="file:///E:/tmp/tmpya5m7do5/svg0.png" id="41" name="Picture"/>
                     <pic:cNvPicPr>
                       <a:picLocks noChangeArrowheads="1" noChangeAspect="1"/>
                     </pic:cNvPicPr>
@@ -9114,7 +9114,7 @@
                     <a:graphicData uri="http://schemas.openxmlformats.org/drawingml/2006/picture">
                       <pic:pic>
                         <pic:nvPicPr>
-                          <pic:cNvPr descr="file:///E:/tmp/tmpptqqmsvb/svg1.png" id="48" name="Picture"/>
+                          <pic:cNvPr descr="file:///E:/tmp/tmpya5m7do5/svg1.png" id="48" name="Picture"/>
                           <pic:cNvPicPr>
                             <a:picLocks noChangeArrowheads="1" noChangeAspect="1"/>
                           </pic:cNvPicPr>
@@ -9156,7 +9156,7 @@
                     <a:graphicData uri="http://schemas.openxmlformats.org/drawingml/2006/picture">
                       <pic:pic>
                         <pic:nvPicPr>
-                          <pic:cNvPr descr="file:///E:/tmp/tmpptqqmsvb/svg2.png" id="51" name="Picture"/>
+                          <pic:cNvPr descr="file:///E:/tmp/tmpya5m7do5/svg2.png" id="51" name="Picture"/>
                           <pic:cNvPicPr>
                             <a:picLocks noChangeArrowheads="1" noChangeAspect="1"/>
                           </pic:cNvPicPr>
@@ -10404,31 +10404,31 @@
         <w:t xml:space="preserve"> </w:t>
       </w:r>
       <w:r>
-        <w:t xml:space="preserve">of about two points with perfect class ordering at every group size from 50 to 500 tiles,</w:t>
-      </w:r>
-      <w:r>
-        <w:t xml:space="preserve"> </w:t>
-      </w:r>
-      <w:r>
-        <w:t xml:space="preserve">so on a 500-tile bundle the decision costs one encode of four percent of the tiles. Its</w:t>
-      </w:r>
-      <w:r>
-        <w:t xml:space="preserve"> </w:t>
-      </w:r>
-      <w:r>
-        <w:t xml:space="preserve">only slip is the WebP near-break-even regime, where the shared-quantizer penalty deepens</w:t>
-      </w:r>
-      <w:r>
-        <w:t xml:space="preserve"> </w:t>
-      </w:r>
-      <w:r>
-        <w:t xml:space="preserve">with group size faster than a small probe registers, the one case a practitioner should</w:t>
-      </w:r>
-      <w:r>
-        <w:t xml:space="preserve"> </w:t>
-      </w:r>
-      <w:r>
-        <w:t xml:space="preserve">confirm on the full set.</w:t>
+        <w:t xml:space="preserve">of about two points at every group size from 50 to 500 tiles, and orders the tested</w:t>
+      </w:r>
+      <w:r>
+        <w:t xml:space="preserve"> </w:t>
+      </w:r>
+      <w:r>
+        <w:t xml:space="preserve">class-codec cells correctly, so on a 500-tile bundle the decision measures just four</w:t>
+      </w:r>
+      <w:r>
+        <w:t xml:space="preserve"> </w:t>
+      </w:r>
+      <w:r>
+        <w:t xml:space="preserve">percent of the tiles. Its only slip is the WebP near-break-even regime, where the</w:t>
+      </w:r>
+      <w:r>
+        <w:t xml:space="preserve"> </w:t>
+      </w:r>
+      <w:r>
+        <w:t xml:space="preserve">shared-quantizer penalty deepens with group size faster than a small probe registers, the</w:t>
+      </w:r>
+      <w:r>
+        <w:t xml:space="preserve"> </w:t>
+      </w:r>
+      <w:r>
+        <w:t xml:space="preserve">one case a practitioner should confirm on the full set.</w:t>
       </w:r>
       <w:r>
         <w:t xml:space="preserve"> </w:t>
@@ -11187,7 +11187,7 @@
               <a:graphicData uri="http://schemas.openxmlformats.org/drawingml/2006/picture">
                 <pic:pic>
                   <pic:nvPicPr>
-                    <pic:cNvPr descr="file:///E:/tmp/tmpptqqmsvb/svg3.png" id="58" name="Picture"/>
+                    <pic:cNvPr descr="file:///E:/tmp/tmpya5m7do5/svg3.png" id="58" name="Picture"/>
                     <pic:cNvPicPr>
                       <a:picLocks noChangeArrowheads="1" noChangeAspect="1"/>
                     </pic:cNvPicPr>
@@ -11427,7 +11427,7 @@
               <a:graphicData uri="http://schemas.openxmlformats.org/drawingml/2006/picture">
                 <pic:pic>
                   <pic:nvPicPr>
-                    <pic:cNvPr descr="file:///E:/tmp/tmpptqqmsvb/svg4.png" id="62" name="Picture"/>
+                    <pic:cNvPr descr="file:///E:/tmp/tmpya5m7do5/svg4.png" id="62" name="Picture"/>
                     <pic:cNvPicPr>
                       <a:picLocks noChangeArrowheads="1" noChangeAspect="1"/>
                     </pic:cNvPicPr>

</xml_diff>

<commit_message>
Improve Table 8 (predictor comparison) layout: tighten caption, widen narrow table
The 4-row table sat under a long paragraph-length caption crammed to the table's
350px width, looking unbalanced. Tightened the caption to the essentials (the
Section 6.1 prose carries the detail), moved the codec-differential numbers
(10.1 vs 7.1) into that prose, and set the table to min-width 62% so it reads at
446px. Caption block height ~485px -> ~268px. No data change.

Co-Authored-By: Claude Fable 5 <noreply@anthropic.com>
</commit_message>
<xml_diff>
--- a/docs/paper.docx
+++ b/docs/paper.docx
@@ -3565,7 +3565,7 @@
               <a:graphicData uri="http://schemas.openxmlformats.org/drawingml/2006/picture">
                 <pic:pic>
                   <pic:nvPicPr>
-                    <pic:cNvPr descr="file:///E:/tmp/tmpac5pquup/svg0.png" id="41" name="Picture"/>
+                    <pic:cNvPr descr="file:///E:/tmp/tmp87cll_nf/svg0.png" id="41" name="Picture"/>
                     <pic:cNvPicPr>
                       <a:picLocks noChangeArrowheads="1" noChangeAspect="1"/>
                     </pic:cNvPicPr>
@@ -9114,7 +9114,7 @@
                     <a:graphicData uri="http://schemas.openxmlformats.org/drawingml/2006/picture">
                       <pic:pic>
                         <pic:nvPicPr>
-                          <pic:cNvPr descr="file:///E:/tmp/tmpac5pquup/svg1.png" id="48" name="Picture"/>
+                          <pic:cNvPr descr="file:///E:/tmp/tmp87cll_nf/svg1.png" id="48" name="Picture"/>
                           <pic:cNvPicPr>
                             <a:picLocks noChangeArrowheads="1" noChangeAspect="1"/>
                           </pic:cNvPicPr>
@@ -9156,7 +9156,7 @@
                     <a:graphicData uri="http://schemas.openxmlformats.org/drawingml/2006/picture">
                       <pic:pic>
                         <pic:nvPicPr>
-                          <pic:cNvPr descr="file:///E:/tmp/tmpac5pquup/svg2.png" id="51" name="Picture"/>
+                          <pic:cNvPr descr="file:///E:/tmp/tmp87cll_nf/svg2.png" id="51" name="Picture"/>
                           <pic:cNvPicPr>
                             <a:picLocks noChangeArrowheads="1" noChangeAspect="1"/>
                           </pic:cNvPicPr>
@@ -10362,19 +10362,25 @@
         <w:t xml:space="preserve"> </w:t>
       </w:r>
       <w:r>
-        <w:t xml:space="preserve">on that baseline, and it fails even on the isolated codec differential that cancels the</w:t>
-      </w:r>
-      <w:r>
-        <w:t xml:space="preserve"> </w:t>
-      </w:r>
-      <w:r>
-        <w:t xml:space="preserve">fixed-cost term (Table 8): the adaptive-state penalty is codec-mechanistic and is</w:t>
-      </w:r>
-      <w:r>
-        <w:t xml:space="preserve"> </w:t>
-      </w:r>
-      <w:r>
-        <w:t xml:space="preserve">not captured by these cheap source features. What does recover it is a measurement, not a</w:t>
+        <w:t xml:space="preserve">on that baseline (Table 8), and it fails even on the isolated codec differential that</w:t>
+      </w:r>
+      <w:r>
+        <w:t xml:space="preserve"> </w:t>
+      </w:r>
+      <w:r>
+        <w:t xml:space="preserve">cancels the fixed-cost term (10.1 against a constant's 7.1 percentage points): the</w:t>
+      </w:r>
+      <w:r>
+        <w:t xml:space="preserve"> </w:t>
+      </w:r>
+      <w:r>
+        <w:t xml:space="preserve">adaptive-state penalty is codec-mechanistic and is not captured by these cheap source</w:t>
+      </w:r>
+      <w:r>
+        <w:t xml:space="preserve"> </w:t>
+      </w:r>
+      <w:r>
+        <w:t xml:space="preserve">features. What does recover it is a measurement, not a</w:t>
       </w:r>
       <w:r>
         <w:t xml:space="preserve"> </w:t>
@@ -10470,7 +10476,7 @@
         <w:t xml:space="preserve"> </w:t>
       </w:r>
       <w:r>
-        <w:t xml:space="preserve">Predicting a group's atlas saving before building it, evaluated leave-one-content-class-out over eight classes spanning extreme image statistics (natural photos, emoji, flags, avatars, and synthetic gradients, noise, UI mockups, and objects on white; JPEG and WebP). Error is mean absolute error in percentage points against the measured saving; rank is Spearman correlation with it. Six cheap source-image features do not improve on a size-and-codec baseline, but a probe encode of 10–20 tiles predicts the full-set saving to within about two points, and orders the classes far better than the baseline's rank (0.86). On the isolated codec differential (JPEG minus WebP saving, which cancels the fixed-cost term), the same features still fail to beat a constant (10.1 vs 7.1 percentage points), so the shortfall is not a missing fixed-cost signal but the coupling penalty not being captured by these cheap features. Evaluated on 47 of the 48 class-size-codec cells; one cell whose two rate-distortion curves did not overlap in quality is omitted.</w:t>
+        <w:t xml:space="preserve">Predicting a group's atlas saving before building it, leave-one-content-class-out over eight classes spanning extreme image statistics (JPEG and WebP; 47 of 48 cells, one omitted for no overlapping quality range). Error is mean absolute error (percentage points) against the measured saving; rank is Spearman correlation with it. Six cheap source-image features do not beat a size-and-codec baseline, but a 10–20 tile probe encode predicts the saving to about two points and orders the classes far better.</w:t>
       </w:r>
     </w:p>
     <w:tbl>
@@ -10478,7 +10484,7 @@
         <w:tblStyle w:val="Table"/>
         <w:tblW w:type="auto" w:w="0"/>
         <w:tblLook w:firstRow="1" w:lastRow="0" w:firstColumn="0" w:lastColumn="0" w:noHBand="0" w:noVBand="0" w:val="0020"/>
-        <w:tblCaption w:val="Table 8. Predicting a group's atlas saving before building it, evaluated leave-one-content-class-out over eight classes spanning extreme image statistics (natural photos, emoji, flags, avatars, and synthetic gradients, noise, UI mockups, and objects on white; JPEG and WebP). Error is mean absolute error in percentage points against the measured saving; rank is Spearman correlation with it. Six cheap source-image features do not improve on a size-and-codec baseline, but a probe encode of 10–20 tiles predicts the full-set saving to within about two points, and orders the classes far better than the baseline's rank (0.86). On the isolated codec differential (JPEG minus WebP saving, which cancels the fixed-cost term), the same features still fail to beat a constant (10.1 vs 7.1 percentage points), so the shortfall is not a missing fixed-cost signal but the coupling penalty not being captured by these cheap features. Evaluated on 47 of the 48 class-size-codec cells; one cell whose two rate-distortion curves did not overlap in quality is omitted."/>
+        <w:tblCaption w:val="Table 8. Predicting a group's atlas saving before building it, leave-one-content-class-out over eight classes spanning extreme image statistics (JPEG and WebP; 47 of 48 cells, one omitted for no overlapping quality range). Error is mean absolute error (percentage points) against the measured saving; rank is Spearman correlation with it. Six cheap source-image features do not beat a size-and-codec baseline, but a 10–20 tile probe encode predicts the saving to about two points and orders the classes far better."/>
       </w:tblPr>
       <w:tblGrid>
         <w:gridCol w:w="2640"/>
@@ -11187,7 +11193,7 @@
               <a:graphicData uri="http://schemas.openxmlformats.org/drawingml/2006/picture">
                 <pic:pic>
                   <pic:nvPicPr>
-                    <pic:cNvPr descr="file:///E:/tmp/tmpac5pquup/svg3.png" id="58" name="Picture"/>
+                    <pic:cNvPr descr="file:///E:/tmp/tmp87cll_nf/svg3.png" id="58" name="Picture"/>
                     <pic:cNvPicPr>
                       <a:picLocks noChangeArrowheads="1" noChangeAspect="1"/>
                     </pic:cNvPicPr>
@@ -11427,7 +11433,7 @@
               <a:graphicData uri="http://schemas.openxmlformats.org/drawingml/2006/picture">
                 <pic:pic>
                   <pic:nvPicPr>
-                    <pic:cNvPr descr="file:///E:/tmp/tmpac5pquup/svg4.png" id="62" name="Picture"/>
+                    <pic:cNvPr descr="file:///E:/tmp/tmp87cll_nf/svg4.png" id="62" name="Picture"/>
                     <pic:cNvPicPr>
                       <a:picLocks noChangeArrowheads="1" noChangeAspect="1"/>
                     </pic:cNvPicPr>

</xml_diff>

<commit_message>
Consistency: state the 521-photo validation as dedup-cost (byte-neutral vs dedup), matching the real-site framing
The heuristic-validation sentence said the 521 photo thumbnails go to byte-bundles
"at 21% fewer bytes"; verified that is +21.1% vs per-reference but -0.4% vs a
deduplicated baseline (119/521 are exact repeats), the same pattern the real-site
paragraph now discloses. Reworded to "collapse 521 requests to four at the
deduplicated byte cost (21% below per-reference, almost all of it the folded
repeats)". Verified the e39 dictionary-delta numbers (25KB@5, 237KB@50, 2.8MB
whole-atlas) are correct against the data.

Co-Authored-By: Claude Fable 5 <noreply@anthropic.com>
</commit_message>
<xml_diff>
--- a/docs/paper.docx
+++ b/docs/paper.docx
@@ -3565,7 +3565,7 @@
               <a:graphicData uri="http://schemas.openxmlformats.org/drawingml/2006/picture">
                 <pic:pic>
                   <pic:nvPicPr>
-                    <pic:cNvPr descr="file:///E:/tmp/tmp3khm2bmd/svg0.png" id="41" name="Picture"/>
+                    <pic:cNvPr descr="file:///E:/tmp/tmp14zef46h/svg0.png" id="41" name="Picture"/>
                     <pic:cNvPicPr>
                       <a:picLocks noChangeArrowheads="1" noChangeAspect="1"/>
                     </pic:cNvPicPr>
@@ -9126,7 +9126,7 @@
                     <a:graphicData uri="http://schemas.openxmlformats.org/drawingml/2006/picture">
                       <pic:pic>
                         <pic:nvPicPr>
-                          <pic:cNvPr descr="file:///E:/tmp/tmp3khm2bmd/svg1.png" id="48" name="Picture"/>
+                          <pic:cNvPr descr="file:///E:/tmp/tmp14zef46h/svg1.png" id="48" name="Picture"/>
                           <pic:cNvPicPr>
                             <a:picLocks noChangeArrowheads="1" noChangeAspect="1"/>
                           </pic:cNvPicPr>
@@ -9168,7 +9168,7 @@
                     <a:graphicData uri="http://schemas.openxmlformats.org/drawingml/2006/picture">
                       <pic:pic>
                         <pic:nvPicPr>
-                          <pic:cNvPr descr="file:///E:/tmp/tmp3khm2bmd/svg2.png" id="51" name="Picture"/>
+                          <pic:cNvPr descr="file:///E:/tmp/tmp14zef46h/svg2.png" id="51" name="Picture"/>
                           <pic:cNvPicPr>
                             <a:picLocks noChangeArrowheads="1" noChangeAspect="1"/>
                           </pic:cNvPicPr>
@@ -11205,7 +11205,7 @@
               <a:graphicData uri="http://schemas.openxmlformats.org/drawingml/2006/picture">
                 <pic:pic>
                   <pic:nvPicPr>
-                    <pic:cNvPr descr="file:///E:/tmp/tmp3khm2bmd/svg3.png" id="58" name="Picture"/>
+                    <pic:cNvPr descr="file:///E:/tmp/tmp14zef46h/svg3.png" id="58" name="Picture"/>
                     <pic:cNvPicPr>
                       <a:picLocks noChangeArrowheads="1" noChangeAspect="1"/>
                     </pic:cNvPicPr>
@@ -11422,13 +11422,25 @@
         <w:t xml:space="preserve"> </w:t>
       </w:r>
       <w:r>
-        <w:t xml:space="preserve">chunks at 21% fewer bytes, with 521 requests becoming four in both cases. An accounting</w:t>
-      </w:r>
-      <w:r>
-        <w:t xml:space="preserve"> </w:t>
-      </w:r>
-      <w:r>
-        <w:t xml:space="preserve">check confirms the emitted bytes and request count equal what the tool reports.</w:t>
+        <w:t xml:space="preserve">chunks that collapse 521 requests to four at the deduplicated byte cost (21% below</w:t>
+      </w:r>
+      <w:r>
+        <w:t xml:space="preserve"> </w:t>
+      </w:r>
+      <w:r>
+        <w:t xml:space="preserve">per-reference serving, almost all of it the folded repeats, as on the real directory</w:t>
+      </w:r>
+      <w:r>
+        <w:t xml:space="preserve"> </w:t>
+      </w:r>
+      <w:r>
+        <w:t xml:space="preserve">below). An accounting check confirms the emitted bytes and request count equal what the</w:t>
+      </w:r>
+      <w:r>
+        <w:t xml:space="preserve"> </w:t>
+      </w:r>
+      <w:r>
+        <w:t xml:space="preserve">tool reports.</w:t>
       </w:r>
     </w:p>
     <w:p>
@@ -11445,7 +11457,7 @@
               <a:graphicData uri="http://schemas.openxmlformats.org/drawingml/2006/picture">
                 <pic:pic>
                   <pic:nvPicPr>
-                    <pic:cNvPr descr="file:///E:/tmp/tmp3khm2bmd/svg4.png" id="62" name="Picture"/>
+                    <pic:cNvPr descr="file:///E:/tmp/tmp14zef46h/svg4.png" id="62" name="Picture"/>
                     <pic:cNvPicPr>
                       <a:picLocks noChangeArrowheads="1" noChangeAspect="1"/>
                     </pic:cNvPicPr>

</xml_diff>

<commit_message>
Add elsarticle 2-col LaTeX + 2-col Word deliverables; 5 download badges
Two-column paper production via the TwoColPaper skill conventions:
- 2-col PDF (canonical) rebuilt on the Elsevier elsarticle class with
  frontmatter (corresponding author, \ead, \journal), keeping the working
  table/figure/reference pipeline (the html2tex converter alone drops this
  HTML's tables/figures/refs, so it is driven from build_latex.py).
- 2-col Word DOCX + its PDF render (LibreOffice) via the html2doc
  two-column profile (build_2col_word.py); wide tables span full-width.
- Top-right badges now expose all five: PDF/DOCX 1-col, PDF/DOCX 2-col,
  and the 2-col LaTeX PDF.
- Drop "Technical Report / year" from the header and footer.

Deliverables in docs/: paper.pdf, paper.docx, paper-2col.pdf (LaTeX),
paper-2col.docx, paper-2col-word.pdf.

Co-Authored-By: Claude Opus 4.8 <noreply@anthropic.com>
</commit_message>
<xml_diff>
--- a/docs/paper.docx
+++ b/docs/paper.docx
@@ -84,14 +84,6 @@
       </w:r>
       <w:r>
         <w:t xml:space="preserve">Academic College of Engineering, Tel-Aviv, Israel</w:t>
-      </w:r>
-    </w:p>
-    <w:p>
-      <w:pPr>
-        <w:pStyle w:val="BodyText"/>
-      </w:pPr>
-      <w:r>
-        <w:t xml:space="preserve">Technical Report · 2026</w:t>
       </w:r>
     </w:p>
     <w:p>
@@ -3547,7 +3539,7 @@
               <a:graphicData uri="http://schemas.openxmlformats.org/drawingml/2006/picture">
                 <pic:pic>
                   <pic:nvPicPr>
-                    <pic:cNvPr descr="file:///E:/tmp/tmp1bgpb3lq/svg0.png" id="41" name="Picture"/>
+                    <pic:cNvPr descr="file:///E:/tmp/tmpcw57_9s_/svg0.png" id="41" name="Picture"/>
                     <pic:cNvPicPr>
                       <a:picLocks noChangeArrowheads="1" noChangeAspect="1"/>
                     </pic:cNvPicPr>
@@ -9132,7 +9124,7 @@
                     <a:graphicData uri="http://schemas.openxmlformats.org/drawingml/2006/picture">
                       <pic:pic>
                         <pic:nvPicPr>
-                          <pic:cNvPr descr="file:///E:/tmp/tmp1bgpb3lq/svg1.png" id="48" name="Picture"/>
+                          <pic:cNvPr descr="file:///E:/tmp/tmpcw57_9s_/svg1.png" id="48" name="Picture"/>
                           <pic:cNvPicPr>
                             <a:picLocks noChangeArrowheads="1" noChangeAspect="1"/>
                           </pic:cNvPicPr>
@@ -9174,7 +9166,7 @@
                     <a:graphicData uri="http://schemas.openxmlformats.org/drawingml/2006/picture">
                       <pic:pic>
                         <pic:nvPicPr>
-                          <pic:cNvPr descr="file:///E:/tmp/tmp1bgpb3lq/svg2.png" id="51" name="Picture"/>
+                          <pic:cNvPr descr="file:///E:/tmp/tmpcw57_9s_/svg2.png" id="51" name="Picture"/>
                           <pic:cNvPicPr>
                             <a:picLocks noChangeArrowheads="1" noChangeAspect="1"/>
                           </pic:cNvPicPr>
@@ -11211,7 +11203,7 @@
               <a:graphicData uri="http://schemas.openxmlformats.org/drawingml/2006/picture">
                 <pic:pic>
                   <pic:nvPicPr>
-                    <pic:cNvPr descr="file:///E:/tmp/tmp1bgpb3lq/svg3.png" id="58" name="Picture"/>
+                    <pic:cNvPr descr="file:///E:/tmp/tmpcw57_9s_/svg3.png" id="58" name="Picture"/>
                     <pic:cNvPicPr>
                       <a:picLocks noChangeArrowheads="1" noChangeAspect="1"/>
                     </pic:cNvPicPr>
@@ -11463,7 +11455,7 @@
               <a:graphicData uri="http://schemas.openxmlformats.org/drawingml/2006/picture">
                 <pic:pic>
                   <pic:nvPicPr>
-                    <pic:cNvPr descr="file:///E:/tmp/tmp1bgpb3lq/svg4.png" id="62" name="Picture"/>
+                    <pic:cNvPr descr="file:///E:/tmp/tmpcw57_9s_/svg4.png" id="62" name="Picture"/>
                     <pic:cNvPicPr>
                       <a:picLocks noChangeArrowheads="1" noChangeAspect="1"/>
                     </pic:cNvPicPr>
@@ -14194,7 +14186,7 @@
         <w:pStyle w:val="BodyText"/>
       </w:pPr>
       <w:r>
-        <w:t xml:space="preserve">Alexander Apartsin, Yehudit Aperstein · 2026</w:t>
+        <w:t xml:space="preserve">Alexander Apartsin, Yehudit Aperstein</w:t>
       </w:r>
     </w:p>
     <w:bookmarkEnd w:id="68"/>

</xml_diff>